<commit_message>
Remove shaded boxes from Spanish job ad
</commit_message>
<xml_diff>
--- a/downloads/empleo_encargados_estaciones_espanol.docx
+++ b/downloads/empleo_encargados_estaciones_espanol.docx
@@ -6,7 +6,7 @@
       <w:pPr>
         <w:pStyle w:val="Heading1"/>
         <w:bidi w:val="0"/>
-        <w:spacing w:before="240" w:after="120"/>
+        <w:spacing w:before="240" w:after="100"/>
         <w:jc w:val="left"/>
         <w:rPr/>
       </w:pPr>
@@ -19,7 +19,7 @@
       <w:pPr>
         <w:pStyle w:val="BodyTexttagline"/>
         <w:bidi w:val="0"/>
-        <w:spacing w:before="120" w:after="360"/>
+        <w:spacing w:before="120" w:after="320"/>
         <w:jc w:val="left"/>
         <w:rPr/>
       </w:pPr>
@@ -46,24 +46,19 @@
       <w:pPr>
         <w:pStyle w:val="BodyText"/>
         <w:bidi w:val="0"/>
-        <w:spacing w:before="240" w:after="360"/>
-        <w:ind w:hanging="0" w:left="240" w:right="240"/>
+        <w:spacing w:before="120" w:after="120"/>
+        <w:ind w:left="120" w:right="120"/>
         <w:jc w:val="left"/>
         <w:rPr/>
       </w:pPr>
       <w:r>
         <w:rPr>
           <w:rStyle w:val="Strong"/>
-          <w:bdr w:val="single" w:sz="30" w:space="12" w:color="2E75B6"/>
-          <w:shd w:fill="EEF4F8" w:val="clear"/>
         </w:rPr>
         <w:t>Requisito:</w:t>
       </w:r>
       <w:r>
-        <w:rPr>
-          <w:bdr w:val="single" w:sz="30" w:space="12" w:color="2E75B6"/>
-          <w:shd w:fill="EEF4F8" w:val="clear"/>
-        </w:rPr>
+        <w:rPr/>
         <w:t xml:space="preserve"> Es necesario tener vehículo propio.</w:t>
       </w:r>
     </w:p>
@@ -71,24 +66,19 @@
       <w:pPr>
         <w:pStyle w:val="BodyText"/>
         <w:bidi w:val="0"/>
-        <w:spacing w:before="240" w:after="360"/>
-        <w:ind w:hanging="0" w:left="240" w:right="240"/>
+        <w:spacing w:before="120" w:after="120"/>
+        <w:ind w:left="120" w:right="120"/>
         <w:jc w:val="left"/>
         <w:rPr/>
       </w:pPr>
       <w:r>
         <w:rPr>
           <w:rStyle w:val="Strong"/>
-          <w:bdr w:val="single" w:sz="30" w:space="12" w:color="2E75B6"/>
-          <w:shd w:fill="EEF4F8" w:val="clear"/>
         </w:rPr>
         <w:t>Horario:</w:t>
       </w:r>
       <w:r>
-        <w:rPr>
-          <w:bdr w:val="single" w:sz="30" w:space="12" w:color="2E75B6"/>
-          <w:shd w:fill="EEF4F8" w:val="clear"/>
-        </w:rPr>
+        <w:rPr/>
         <w:t xml:space="preserve"> De 11:00 p. m. a 7:00 a. m.</w:t>
       </w:r>
     </w:p>
@@ -96,19 +86,13 @@
       <w:pPr>
         <w:pStyle w:val="BodyText"/>
         <w:bidi w:val="0"/>
-        <w:spacing w:before="240" w:after="360"/>
-        <w:ind w:hanging="0" w:left="240" w:right="240"/>
-        <w:jc w:val="left"/>
-        <w:rPr>
-          <w:bdr w:val="single" w:sz="30" w:space="12" w:color="2E75B6"/>
-          <w:shd w:fill="EEF4F8" w:val="clear"/>
-        </w:rPr>
-      </w:pPr>
-      <w:r>
-        <w:rPr>
-          <w:bdr w:val="single" w:sz="30" w:space="12" w:color="2E75B6"/>
-          <w:shd w:fill="EEF4F8" w:val="clear"/>
-        </w:rPr>
+        <w:spacing w:before="120" w:after="120"/>
+        <w:ind w:left="120" w:right="120"/>
+        <w:jc w:val="left"/>
+        <w:rPr/>
+      </w:pPr>
+      <w:r>
+        <w:rPr/>
         <w:t>De DOMINGO A MARTES y de MIÉRCOLES A SÁBADO, alternándose cada semana. (Existe cierta flexibilidad).</w:t>
       </w:r>
     </w:p>
@@ -116,32 +100,32 @@
       <w:pPr>
         <w:pStyle w:val="BodyText"/>
         <w:bidi w:val="0"/>
-        <w:spacing w:before="240" w:after="360"/>
-        <w:ind w:hanging="0" w:left="240" w:right="240"/>
+        <w:spacing w:before="120" w:after="120"/>
+        <w:ind w:left="120" w:right="120"/>
         <w:jc w:val="left"/>
         <w:rPr/>
       </w:pPr>
       <w:r>
         <w:rPr>
           <w:rStyle w:val="Strong"/>
-          <w:bdr w:val="single" w:sz="30" w:space="12" w:color="2E75B6"/>
-          <w:shd w:fill="EEF4F8" w:val="clear"/>
         </w:rPr>
         <w:t>Pago:</w:t>
       </w:r>
       <w:r>
-        <w:rPr>
-          <w:bdr w:val="single" w:sz="30" w:space="12" w:color="2E75B6"/>
-          <w:shd w:fill="EEF4F8" w:val="clear"/>
-        </w:rPr>
+        <w:rPr/>
         <w:t xml:space="preserve"> $23.50 por hora.</w:t>
       </w:r>
     </w:p>
     <w:p>
       <w:pPr>
         <w:pStyle w:val="Heading2"/>
-        <w:bidi w:val="0"/>
-        <w:ind w:hanging="0"/>
+        <w:numPr>
+          <w:ilvl w:val="0"/>
+          <w:numId w:val="0"/>
+        </w:numPr>
+        <w:bidi w:val="0"/>
+        <w:spacing w:before="320" w:after="120"/>
+        <w:ind w:left="320" w:right="320"/>
         <w:jc w:val="left"/>
         <w:rPr/>
       </w:pPr>
@@ -200,9 +184,8 @@
           <w:ilvl w:val="0"/>
           <w:numId w:val="0"/>
         </w:numPr>
-        <w:pBdr/>
-        <w:bidi w:val="0"/>
-        <w:spacing w:before="320" w:after="140"/>
+        <w:bidi w:val="0"/>
+        <w:spacing w:before="320" w:after="120"/>
         <w:ind w:left="320" w:right="320"/>
         <w:jc w:val="left"/>
         <w:rPr/>
@@ -293,44 +276,21 @@
     </w:p>
     <w:p>
       <w:pPr>
-        <w:pStyle w:val="BodyText"/>
-        <w:bidi w:val="0"/>
-        <w:spacing w:before="360" w:after="120"/>
-        <w:ind w:hanging="0" w:left="0" w:right="0"/>
-        <w:jc w:val="left"/>
-        <w:rPr/>
-      </w:pPr>
-      <w:r>
-        <w:rPr>
-          <w:rStyle w:val="Strong"/>
-          <w:shd w:fill="E8F4EA" w:val="clear"/>
-        </w:rPr>
-        <w:t>Pago:</w:t>
-      </w:r>
-      <w:r>
-        <w:rPr>
-          <w:shd w:fill="E8F4EA" w:val="clear"/>
-        </w:rPr>
-        <w:t xml:space="preserve"> $23.50 por hora (incluye $4.50 por hora como reembolso por el uso del vehículo). </w:t>
-      </w:r>
-      <w:r>
-        <w:rPr>
-          <w:rStyle w:val="Strong"/>
-          <w:shd w:fill="E8F4EA" w:val="clear"/>
-        </w:rPr>
-        <w:t>$1,316 cada dos semanas.</w:t>
-      </w:r>
-      <w:r>
-        <w:rPr>
-          <w:shd w:fill="E8F4EA" w:val="clear"/>
-        </w:rPr>
-        <w:t xml:space="preserve"> </w:t>
+        <w:pStyle w:val="BodyTextpay"/>
+        <w:bidi w:val="0"/>
+        <w:spacing w:before="320" w:after="120"/>
+        <w:jc w:val="left"/>
+        <w:rPr/>
+      </w:pPr>
+      <w:r>
+        <w:rPr/>
+        <w:t>Pago: $23.50 por hora (incluye $4.50 por hora como reembolso por el uso del vehículo). $1,316 cada dos semanas.</w:t>
       </w:r>
     </w:p>
     <w:sectPr>
       <w:type w:val="nextPage"/>
       <w:pgSz w:w="11906" w:h="16838"/>
-      <w:pgMar w:left="1008" w:right="1008" w:gutter="0" w:header="0" w:top="1008" w:footer="0" w:bottom="1008"/>
+      <w:pgMar w:left="1080" w:right="1080" w:gutter="0" w:header="0" w:top="1080" w:footer="0" w:bottom="1080"/>
       <w:pgNumType w:fmt="decimal"/>
       <w:formProt w:val="false"/>
       <w:textDirection w:val="lrTb"/>
@@ -777,7 +737,7 @@
     </w:pPr>
     <w:rPr>
       <w:rFonts w:ascii="Arial;sans-serif" w:hAnsi="Arial;sans-serif" w:eastAsia="Arial;sans-serif" w:cs="Arial;sans-serif"/>
-      <w:color w:val="1F2933"/>
+      <w:color w:val="202020"/>
       <w:sz w:val="23"/>
       <w:szCs w:val="23"/>
       <w:lang w:val="en-US" w:eastAsia="zh-CN" w:bidi="hi-IN"/>
@@ -789,15 +749,15 @@
     <w:next w:val="BodyText"/>
     <w:qFormat/>
     <w:pPr>
-      <w:spacing w:before="240" w:after="120"/>
+      <w:spacing w:before="240" w:after="100"/>
     </w:pPr>
     <w:rPr>
       <w:rFonts w:ascii="Noto Sans" w:hAnsi="Noto Sans"/>
       <w:b/>
       <w:bCs/>
       <w:color w:val="17365D"/>
-      <w:sz w:val="44"/>
-      <w:szCs w:val="44"/>
+      <w:sz w:val="42"/>
+      <w:szCs w:val="42"/>
     </w:rPr>
   </w:style>
   <w:style w:type="paragraph" w:styleId="Heading2">
@@ -810,10 +770,7 @@
         <w:ilvl w:val="0"/>
         <w:numId w:val="0"/>
       </w:numPr>
-      <w:pBdr>
-        <w:bottom w:val="single" w:sz="2" w:space="3" w:color="B8C7D9"/>
-      </w:pBdr>
-      <w:spacing w:before="320" w:after="140"/>
+      <w:spacing w:before="320" w:after="120"/>
       <w:ind w:left="320" w:right="320"/>
       <w:outlineLvl w:val="1"/>
     </w:pPr>
@@ -992,7 +949,7 @@
     <w:basedOn w:val="BodyText"/>
     <w:qFormat/>
     <w:pPr>
-      <w:spacing w:before="120" w:after="360"/>
+      <w:spacing w:before="120" w:after="320"/>
     </w:pPr>
     <w:rPr>
       <w:b/>
@@ -1000,6 +957,19 @@
       <w:color w:val="375A7F"/>
       <w:sz w:val="28"/>
       <w:szCs w:val="28"/>
+    </w:rPr>
+  </w:style>
+  <w:style w:type="paragraph" w:styleId="BodyTextpay">
+    <w:name w:val="Body Text.pay"/>
+    <w:basedOn w:val="BodyText"/>
+    <w:qFormat/>
+    <w:pPr>
+      <w:spacing w:before="320" w:after="120"/>
+    </w:pPr>
+    <w:rPr>
+      <w:b/>
+      <w:bCs/>
+      <w:color w:val="215E2F"/>
     </w:rPr>
   </w:style>
 </w:styles>

</xml_diff>